<commit_message>
Add GPT Round06 final eval patches
</commit_message>
<xml_diff>
--- a/reports/选必二法律主观题框架_从题源生长/v12_2_framework_growth_restart/v13_1_round05_patched_final/选必二法律与生活_法律宝典_v13_1_Round05补丁终版.docx
+++ b/reports/选必二法律主观题框架_从题源生长/v12_2_framework_growth_restart/v13_1_round05_patched_final/选必二法律与生活_法律宝典_v13_1_Round05补丁终版.docx
@@ -572,6 +572,22 @@
     </w:p>
     <w:p>
       <w:pPr>
+        <w:pStyle w:val="Heading2"/>
+      </w:pPr>
+      <w:r>
+        <w:t>五、字段一致性守门</w:t>
+      </w:r>
+    </w:p>
+    <w:p>
+      <w:pPr>
+        <w:spacing w:after="100"/>
+      </w:pPr>
+      <w:r>
+        <w:t>题卡内部必须保持三项一致：A轴主入口、双轴裁决说明、命题路径。若出现残留冲突，以 A轴主入口和最近一轮真实模型裁决说明为准，并修正命题路径；不得让旧路径表述覆盖新裁决。本版已按 GPT Round06 复评修正 CC0213 与 CC0238 的命题路径残留。</w:t>
+      </w:r>
+    </w:p>
+    <w:p>
+      <w:pPr>
         <w:pStyle w:val="Heading1"/>
         <w:pageBreakBefore/>
       </w:pPr>
@@ -2705,7 +2721,7 @@
         <w:spacing w:after="40"/>
       </w:pPr>
       <w:r>
-        <w:t>命题路径：先定A9_消费者权益与经营者义务，再按B4_评析/认识/观点作答；v12.2路径：观点/做法 -&gt; 法律关系和制度背景 -&gt; 判断边界 -&gt; 规范评价。</w:t>
+        <w:t>命题路径：先定A5_知识产权与竞争秩序，再按B4_评析/认识/观点作答；A9只保留经营者义务边界，A8只承接张某劳动纪律副链；v12.2路径：观点/做法 -&gt; 法律关系和制度背景 -&gt; 判断边界 -&gt; 规范评价。</w:t>
       </w:r>
     </w:p>
     <w:p>
@@ -4471,7 +4487,7 @@
         <w:spacing w:after="40"/>
       </w:pPr>
       <w:r>
-        <w:t>命题路径：先定A5_知识产权与竞争秩序，再按B1_表格/裁判要点/补链作答；v12.2路径：形式触发 -&gt; 一格一链 -&gt; 法律关系/法律要件 -&gt; 格内结论。</w:t>
+        <w:t>命题路径：先定A8_劳动关系，再按B1_表格/裁判要点/补链作答；案例一著作权只作为参照格式和副轴说明，不作为主答主轴，也不支撑A5计数；v12.2路径：形式触发 -&gt; 一格一链 -&gt; 法律关系/法律要件 -&gt; 格内结论。</w:t>
       </w:r>
     </w:p>
     <w:p>
@@ -11403,6 +11419,59 @@
                 <w:b w:val="0"/>
                 <w:sz w:val="17"/>
               </w:rPr>
+              <w:t>GPT Round06终评</w:t>
+            </w:r>
+          </w:p>
+        </w:tc>
+        <w:tc>
+          <w:tcPr>
+            <w:tcW w:type="dxa" w:w="3289"/>
+            <w:vAlign w:val="center"/>
+          </w:tcPr>
+          <w:p>
+            <w:r/>
+            <w:r>
+              <w:rPr>
+                <w:rFonts w:ascii="Microsoft YaHei" w:hAnsi="Microsoft YaHei"/>
+                <w:b w:val="0"/>
+                <w:sz w:val="17"/>
+              </w:rPr>
+              <w:t>pass</w:t>
+            </w:r>
+          </w:p>
+        </w:tc>
+        <w:tc>
+          <w:tcPr>
+            <w:tcW w:type="dxa" w:w="3289"/>
+            <w:vAlign w:val="center"/>
+          </w:tcPr>
+          <w:p>
+            <w:r/>
+            <w:r>
+              <w:rPr>
+                <w:rFonts w:ascii="Microsoft YaHei" w:hAnsi="Microsoft YaHei"/>
+                <w:b w:val="0"/>
+                <w:sz w:val="17"/>
+              </w:rPr>
+              <w:t>`../round06_gpt_v13_1_final_eval_with_prior_framework/model_outputs/gpt_round06_v13_1_final_eval_with_prior_framework_raw.md`; verdict `ACCEPT_WITH_MINOR_PATCHES`; required two proposition-path patches applied</w:t>
+            </w:r>
+          </w:p>
+        </w:tc>
+      </w:tr>
+      <w:tr>
+        <w:tc>
+          <w:tcPr>
+            <w:tcW w:type="dxa" w:w="3289"/>
+            <w:vAlign w:val="center"/>
+          </w:tcPr>
+          <w:p>
+            <w:r/>
+            <w:r>
+              <w:rPr>
+                <w:rFonts w:ascii="Microsoft YaHei" w:hAnsi="Microsoft YaHei"/>
+                <w:b w:val="0"/>
+                <w:sz w:val="17"/>
+              </w:rPr>
               <w:t>DOCX直渲染</w:t>
             </w:r>
           </w:p>
@@ -11474,6 +11543,265 @@
       </w:pPr>
       <w:r>
         <w:t>This means Markdown, traceability CSV, DOCX, HTML, PDF, and PDF page-render QA exist. It does not mean DOCX direct visual-render QA passed, because this Windows host lacks LibreOffice/soffice.</w:t>
+      </w:r>
+    </w:p>
+    <w:p>
+      <w:pPr>
+        <w:pStyle w:val="Heading1"/>
+        <w:pageBreakBefore/>
+      </w:pPr>
+      <w:r>
+        <w:t>09 GPT Round06 终评与补丁落实</w:t>
+      </w:r>
+    </w:p>
+    <w:p>
+      <w:pPr>
+        <w:spacing w:after="100"/>
+      </w:pPr>
+      <w:r>
+        <w:t>Status: `round06_gpt_minor_patches_accepted_applied`</w:t>
+      </w:r>
+    </w:p>
+    <w:p>
+      <w:pPr>
+        <w:pStyle w:val="Heading2"/>
+      </w:pPr>
+      <w:r>
+        <w:t>Real GPT Output</w:t>
+      </w:r>
+    </w:p>
+    <w:p>
+      <w:pPr>
+        <w:pStyle w:val="ListBullet"/>
+        <w:spacing w:after="40"/>
+      </w:pPr>
+      <w:r>
+        <w:t>GPT Pro web raw: `../round06_gpt_v13_1_final_eval_with_prior_framework/model_outputs/gpt_round06_v13_1_final_eval_with_prior_framework_raw.md`</w:t>
+      </w:r>
+    </w:p>
+    <w:p>
+      <w:pPr>
+        <w:pStyle w:val="ListBullet"/>
+        <w:spacing w:after="40"/>
+      </w:pPr>
+      <w:r>
+        <w:t>Payload: `../round06_gpt_v13_1_final_eval_with_prior_framework/web_payloads/GPT_ROUND06_V13_1_FINAL_EVAL_WITH_PRIOR_FRAMEWORK_PAYLOAD.md`</w:t>
+      </w:r>
+    </w:p>
+    <w:p>
+      <w:pPr>
+        <w:pStyle w:val="ListBullet"/>
+        <w:spacing w:after="40"/>
+      </w:pPr>
+      <w:r>
+        <w:t>Codex adjudication: `../round06_gpt_v13_1_final_eval_with_prior_framework/codex_adjudication/CODEX_ROUND06_GPT_FINAL_EVAL_ADJUDICATION.md`</w:t>
+      </w:r>
+    </w:p>
+    <w:p>
+      <w:pPr>
+        <w:pStyle w:val="Heading2"/>
+      </w:pPr>
+      <w:r>
+        <w:t>GPT Verdict</w:t>
+      </w:r>
+    </w:p>
+    <w:p>
+      <w:pPr>
+        <w:spacing w:after="100"/>
+      </w:pPr>
+      <w:r>
+        <w:t>`ACCEPT_WITH_MINOR_PATCHES`</w:t>
+      </w:r>
+    </w:p>
+    <w:p>
+      <w:pPr>
+        <w:spacing w:after="100"/>
+      </w:pPr>
+      <w:r>
+        <w:t>GPT 认为：</w:t>
+      </w:r>
+    </w:p>
+    <w:p>
+      <w:pPr>
+        <w:pStyle w:val="ListBullet"/>
+        <w:spacing w:after="40"/>
+      </w:pPr>
+      <w:r>
+        <w:t>A轴/B轴就是最终框架，不需要第三轴。</w:t>
+      </w:r>
+    </w:p>
+    <w:p>
+      <w:pPr>
+        <w:pStyle w:val="ListBullet"/>
+        <w:spacing w:after="40"/>
+      </w:pPr>
+      <w:r>
+        <w:t>v13.1 保住了旧框架的法条基础 + 法治意义、民事法律关系三要素、材料触发意识、程序工具、疑难点预警。</w:t>
+      </w:r>
+    </w:p>
+    <w:p>
+      <w:pPr>
+        <w:pStyle w:val="ListBullet"/>
+        <w:spacing w:after="40"/>
+      </w:pPr>
+      <w:r>
+        <w:t>v13.1 基本修掉了旧框架的混合层级、意义口号化、学生操作顺序弱、来源支持弱等问题。</w:t>
+      </w:r>
+    </w:p>
+    <w:p>
+      <w:pPr>
+        <w:pStyle w:val="ListBullet"/>
+        <w:spacing w:after="40"/>
+      </w:pPr>
+      <w:r>
+        <w:t>开放容器/reference-only 行被正确排除在 42 题支持数之外。</w:t>
+      </w:r>
+    </w:p>
+    <w:p>
+      <w:pPr>
+        <w:pStyle w:val="Heading2"/>
+      </w:pPr>
+      <w:r>
+        <w:t>已落实补丁</w:t>
+      </w:r>
+    </w:p>
+    <w:tbl>
+      <w:tblPr>
+        <w:tblStyle w:val="TableGrid"/>
+        <w:tblW w:type="auto" w:w="0"/>
+        <w:jc w:val="center"/>
+        <w:tblLook w:firstColumn="1" w:firstRow="1" w:lastColumn="0" w:lastRow="0" w:noHBand="0" w:noVBand="1" w:val="04A0"/>
+      </w:tblPr>
+      <w:tblGrid>
+        <w:gridCol w:w="4933"/>
+        <w:gridCol w:w="4933"/>
+      </w:tblGrid>
+      <w:tr>
+        <w:tc>
+          <w:tcPr>
+            <w:tcW w:type="dxa" w:w="4933"/>
+            <w:vAlign w:val="center"/>
+            <w:shd w:fill="E8EEF5"/>
+          </w:tcPr>
+          <w:p>
+            <w:r/>
+            <w:r>
+              <w:rPr>
+                <w:rFonts w:ascii="Microsoft YaHei" w:hAnsi="Microsoft YaHei"/>
+                <w:b/>
+                <w:sz w:val="17"/>
+              </w:rPr>
+              <w:t>question_id</w:t>
+            </w:r>
+          </w:p>
+        </w:tc>
+        <w:tc>
+          <w:tcPr>
+            <w:tcW w:type="dxa" w:w="4933"/>
+            <w:vAlign w:val="center"/>
+            <w:shd w:fill="E8EEF5"/>
+          </w:tcPr>
+          <w:p>
+            <w:r/>
+            <w:r>
+              <w:rPr>
+                <w:rFonts w:ascii="Microsoft YaHei" w:hAnsi="Microsoft YaHei"/>
+                <w:b/>
+                <w:sz w:val="17"/>
+              </w:rPr>
+              <w:t>patch</w:t>
+            </w:r>
+          </w:p>
+        </w:tc>
+      </w:tr>
+      <w:tr>
+        <w:tc>
+          <w:tcPr>
+            <w:tcW w:type="dxa" w:w="4933"/>
+            <w:vAlign w:val="center"/>
+          </w:tcPr>
+          <w:p>
+            <w:r/>
+            <w:r>
+              <w:rPr>
+                <w:rFonts w:ascii="Microsoft YaHei" w:hAnsi="Microsoft YaHei"/>
+                <w:b w:val="0"/>
+                <w:sz w:val="17"/>
+              </w:rPr>
+              <w:t>CC0213_2025_门头沟_一模_20</w:t>
+            </w:r>
+          </w:p>
+        </w:tc>
+        <w:tc>
+          <w:tcPr>
+            <w:tcW w:type="dxa" w:w="4933"/>
+            <w:vAlign w:val="center"/>
+          </w:tcPr>
+          <w:p>
+            <w:r/>
+            <w:r>
+              <w:rPr>
+                <w:rFonts w:ascii="Microsoft YaHei" w:hAnsi="Microsoft YaHei"/>
+                <w:b w:val="0"/>
+                <w:sz w:val="17"/>
+              </w:rPr>
+              <w:t>命题路径改为先定 A8_劳动关系；案例一著作权只作参照格式和副轴说明，不作主答主轴，也不支撑 A5 计数。</w:t>
+            </w:r>
+          </w:p>
+        </w:tc>
+      </w:tr>
+      <w:tr>
+        <w:tc>
+          <w:tcPr>
+            <w:tcW w:type="dxa" w:w="4933"/>
+            <w:vAlign w:val="center"/>
+          </w:tcPr>
+          <w:p>
+            <w:r/>
+            <w:r>
+              <w:rPr>
+                <w:rFonts w:ascii="Microsoft YaHei" w:hAnsi="Microsoft YaHei"/>
+                <w:b w:val="0"/>
+                <w:sz w:val="17"/>
+              </w:rPr>
+              <w:t>CC0238_2026_东城_二模_19</w:t>
+            </w:r>
+          </w:p>
+        </w:tc>
+        <w:tc>
+          <w:tcPr>
+            <w:tcW w:type="dxa" w:w="4933"/>
+            <w:vAlign w:val="center"/>
+          </w:tcPr>
+          <w:p>
+            <w:r/>
+            <w:r>
+              <w:rPr>
+                <w:rFonts w:ascii="Microsoft YaHei" w:hAnsi="Microsoft YaHei"/>
+                <w:b w:val="0"/>
+                <w:sz w:val="17"/>
+              </w:rPr>
+              <w:t>命题路径改为先定 A5_知识产权与竞争秩序；A9 只保留经营者义务边界，A8 只承接张某劳动纪律副链。</w:t>
+            </w:r>
+          </w:p>
+        </w:tc>
+      </w:tr>
+    </w:tbl>
+    <w:p/>
+    <w:p>
+      <w:pPr>
+        <w:pStyle w:val="Heading2"/>
+      </w:pPr>
+      <w:r>
+        <w:t>新增守门规则</w:t>
+      </w:r>
+    </w:p>
+    <w:p>
+      <w:pPr>
+        <w:spacing w:after="100"/>
+      </w:pPr>
+      <w:r>
+        <w:t>题卡内部必须保持三项一致：A轴主入口、双轴裁决说明、命题路径。若出现残留冲突，以 A轴主入口和最近一轮真实模型裁决说明为准，并修正命题路径。</w:t>
       </w:r>
     </w:p>
     <w:sectPr>

</xml_diff>

<commit_message>
Add xuanbier Confucius closure check
</commit_message>
<xml_diff>
--- a/reports/选必二法律主观题框架_从题源生长/v12_2_framework_growth_restart/v13_1_round05_patched_final/选必二法律与生活_法律宝典_v13_1_Round05补丁终版.docx
+++ b/reports/选必二法律主观题框架_从题源生长/v12_2_framework_growth_restart/v13_1_round05_patched_final/选必二法律与生活_法律宝典_v13_1_Round05补丁终版.docx
@@ -26,7 +26,7 @@
           <w:color w:val="4B5563"/>
           <w:sz w:val="21"/>
         </w:rPr>
-        <w:t>状态：v13_1_final_baodian_round05_patched_pdf_rendered_docx_generated_with_docx_render_caveat</w:t>
+        <w:t>状态：v13_1_final_baodian_round06_confucius_checked_pdf_rendered_docx_generated_with_docx_render_caveat</w:t>
       </w:r>
     </w:p>
     <w:p>
@@ -10796,7 +10796,7 @@
         <w:spacing w:after="100"/>
       </w:pPr>
       <w:r>
-        <w:t>状态：`v13_1_final_baodian_round05_patched_pdf_rendered_docx_generated_with_docx_render_caveat`</w:t>
+        <w:t>状态：`v13_1_final_baodian_round06_confucius_checked_pdf_rendered_docx_generated_with_docx_render_caveat`</w:t>
       </w:r>
     </w:p>
     <w:p>
@@ -11241,7 +11241,7 @@
                 <w:b w:val="0"/>
                 <w:sz w:val="17"/>
               </w:rPr>
-              <w:t>`选必二法律与生活_法律宝典_v13_1_Round05补丁终版.docx`; Word COM opened read-only and computed 41 pages / 1105 paragraphs</w:t>
+              <w:t>`选必二法律与生活_法律宝典_v13_1_Round05补丁终版.docx`; Word COM opened read-only and computed 45 pages / 1191 paragraphs</w:t>
             </w:r>
           </w:p>
         </w:tc>
@@ -11400,7 +11400,7 @@
                 <w:b w:val="0"/>
                 <w:sz w:val="17"/>
               </w:rPr>
-              <w:t>PDF includes the 42-card handbook, open-container appendix, `ACCEPT_AFTER_MINOR_PATCHES`, and Round05 governance</w:t>
+              <w:t>PDF includes the 42-card handbook, open-container appendix, `ACCEPT_AFTER_MINOR_PATCHES`, Round05 governance, GPT Round06 appendix, and Confucius check</w:t>
             </w:r>
           </w:p>
         </w:tc>
@@ -11472,6 +11472,59 @@
                 <w:b w:val="0"/>
                 <w:sz w:val="17"/>
               </w:rPr>
+              <w:t>Confucius artifact-only闭环</w:t>
+            </w:r>
+          </w:p>
+        </w:tc>
+        <w:tc>
+          <w:tcPr>
+            <w:tcW w:type="dxa" w:w="3289"/>
+            <w:vAlign w:val="center"/>
+          </w:tcPr>
+          <w:p>
+            <w:r/>
+            <w:r>
+              <w:rPr>
+                <w:rFonts w:ascii="Microsoft YaHei" w:hAnsi="Microsoft YaHei"/>
+                <w:b w:val="0"/>
+                <w:sz w:val="17"/>
+              </w:rPr>
+              <w:t>pass</w:t>
+            </w:r>
+          </w:p>
+        </w:tc>
+        <w:tc>
+          <w:tcPr>
+            <w:tcW w:type="dxa" w:w="3289"/>
+            <w:vAlign w:val="center"/>
+          </w:tcPr>
+          <w:p>
+            <w:r/>
+            <w:r>
+              <w:rPr>
+                <w:rFonts w:ascii="Microsoft YaHei" w:hAnsi="Microsoft YaHei"/>
+                <w:b w:val="0"/>
+                <w:sz w:val="17"/>
+              </w:rPr>
+              <w:t>`governor_confucius/CONFUCIUS_ARTIFACT_ONLY_CHECK_v13_1.md`; confirms zero-baseline path from material signal to answer skeleton, with DOCX render caveat preserved</w:t>
+            </w:r>
+          </w:p>
+        </w:tc>
+      </w:tr>
+      <w:tr>
+        <w:tc>
+          <w:tcPr>
+            <w:tcW w:type="dxa" w:w="3289"/>
+            <w:vAlign w:val="center"/>
+          </w:tcPr>
+          <w:p>
+            <w:r/>
+            <w:r>
+              <w:rPr>
+                <w:rFonts w:ascii="Microsoft YaHei" w:hAnsi="Microsoft YaHei"/>
+                <w:b w:val="0"/>
+                <w:sz w:val="17"/>
+              </w:rPr>
               <w:t>DOCX直渲染</w:t>
             </w:r>
           </w:p>
@@ -11534,7 +11587,7 @@
         <w:spacing w:after="100"/>
       </w:pPr>
       <w:r>
-        <w:t>`v13_1_final_baodian_round05_patched_pdf_rendered_docx_generated_with_docx_render_caveat`</w:t>
+        <w:t>`v13_1_final_baodian_round06_confucius_checked_pdf_rendered_docx_generated_with_docx_render_caveat`</w:t>
       </w:r>
     </w:p>
     <w:p>
@@ -11542,7 +11595,7 @@
         <w:spacing w:after="100"/>
       </w:pPr>
       <w:r>
-        <w:t>This means Markdown, traceability CSV, DOCX, HTML, PDF, and PDF page-render QA exist. It does not mean DOCX direct visual-render QA passed, because this Windows host lacks LibreOffice/soffice.</w:t>
+        <w:t>This means Markdown, traceability CSV, DOCX, HTML, PDF, PDF page-render QA, and Confucius artifact-only closure exist. It does not mean DOCX direct visual-render QA passed, because this Windows host lacks LibreOffice/soffice.</w:t>
       </w:r>
     </w:p>
     <w:p>
@@ -11802,6 +11855,626 @@
       </w:pPr>
       <w:r>
         <w:t>题卡内部必须保持三项一致：A轴主入口、双轴裁决说明、命题路径。若出现残留冲突，以 A轴主入口和最近一轮真实模型裁决说明为准，并修正命题路径。</w:t>
+      </w:r>
+    </w:p>
+    <w:p>
+      <w:pPr>
+        <w:pStyle w:val="Heading1"/>
+        <w:pageBreakBefore/>
+      </w:pPr>
+      <w:r>
+        <w:t>10 Confucius 零基础成品闭环检查</w:t>
+      </w:r>
+    </w:p>
+    <w:p>
+      <w:pPr>
+        <w:spacing w:after="100"/>
+      </w:pPr>
+      <w:r>
+        <w:t>检查时间：2026-05-23</w:t>
+      </w:r>
+    </w:p>
+    <w:p>
+      <w:pPr>
+        <w:spacing w:after="100"/>
+      </w:pPr>
+      <w:r>
+        <w:t>状态：`confucius_artifact_only_pass_with_docx_render_caveat`</w:t>
+      </w:r>
+    </w:p>
+    <w:p>
+      <w:pPr>
+        <w:pStyle w:val="Heading2"/>
+      </w:pPr>
+      <w:r>
+        <w:t>检查口径</w:t>
+      </w:r>
+    </w:p>
+    <w:p>
+      <w:pPr>
+        <w:spacing w:after="100"/>
+      </w:pPr>
+      <w:r>
+        <w:t>本检查只看已经交付的学生成品本身，不借助工作日志替学生补理解。合格标准是：零基础学生拿到成品后，能按“材料信号 -&gt; A轴法律入口 -&gt; B轴设问动作 -&gt; 命题路径 -&gt; 答案骨架 -&gt; 学生预警”的顺序完成迁移，而不是只背法律目录或空写法治意义。</w:t>
+      </w:r>
+    </w:p>
+    <w:p>
+      <w:pPr>
+        <w:pStyle w:val="Heading2"/>
+      </w:pPr>
+      <w:r>
+        <w:t>新鲜核验</w:t>
+      </w:r>
+    </w:p>
+    <w:tbl>
+      <w:tblPr>
+        <w:tblStyle w:val="TableGrid"/>
+        <w:tblW w:type="auto" w:w="0"/>
+        <w:jc w:val="center"/>
+        <w:tblLook w:firstColumn="1" w:firstRow="1" w:lastColumn="0" w:lastRow="0" w:noHBand="0" w:noVBand="1" w:val="04A0"/>
+      </w:tblPr>
+      <w:tblGrid>
+        <w:gridCol w:w="3289"/>
+        <w:gridCol w:w="3289"/>
+        <w:gridCol w:w="3289"/>
+      </w:tblGrid>
+      <w:tr>
+        <w:tc>
+          <w:tcPr>
+            <w:tcW w:type="dxa" w:w="3289"/>
+            <w:vAlign w:val="center"/>
+            <w:shd w:fill="E8EEF5"/>
+          </w:tcPr>
+          <w:p>
+            <w:r/>
+            <w:r>
+              <w:rPr>
+                <w:rFonts w:ascii="Microsoft YaHei" w:hAnsi="Microsoft YaHei"/>
+                <w:b/>
+                <w:sz w:val="17"/>
+              </w:rPr>
+              <w:t>项目</w:t>
+            </w:r>
+          </w:p>
+        </w:tc>
+        <w:tc>
+          <w:tcPr>
+            <w:tcW w:type="dxa" w:w="3289"/>
+            <w:vAlign w:val="center"/>
+            <w:shd w:fill="E8EEF5"/>
+          </w:tcPr>
+          <w:p>
+            <w:r/>
+            <w:r>
+              <w:rPr>
+                <w:rFonts w:ascii="Microsoft YaHei" w:hAnsi="Microsoft YaHei"/>
+                <w:b/>
+                <w:sz w:val="17"/>
+              </w:rPr>
+              <w:t>结果</w:t>
+            </w:r>
+          </w:p>
+        </w:tc>
+        <w:tc>
+          <w:tcPr>
+            <w:tcW w:type="dxa" w:w="3289"/>
+            <w:vAlign w:val="center"/>
+            <w:shd w:fill="E8EEF5"/>
+          </w:tcPr>
+          <w:p>
+            <w:r/>
+            <w:r>
+              <w:rPr>
+                <w:rFonts w:ascii="Microsoft YaHei" w:hAnsi="Microsoft YaHei"/>
+                <w:b/>
+                <w:sz w:val="17"/>
+              </w:rPr>
+              <w:t>证据</w:t>
+            </w:r>
+          </w:p>
+        </w:tc>
+      </w:tr>
+      <w:tr>
+        <w:tc>
+          <w:tcPr>
+            <w:tcW w:type="dxa" w:w="3289"/>
+            <w:vAlign w:val="center"/>
+          </w:tcPr>
+          <w:p>
+            <w:r/>
+            <w:r>
+              <w:rPr>
+                <w:rFonts w:ascii="Microsoft YaHei" w:hAnsi="Microsoft YaHei"/>
+                <w:b w:val="0"/>
+                <w:sz w:val="17"/>
+              </w:rPr>
+              <w:t>正文题卡</w:t>
+            </w:r>
+          </w:p>
+        </w:tc>
+        <w:tc>
+          <w:tcPr>
+            <w:tcW w:type="dxa" w:w="3289"/>
+            <w:vAlign w:val="center"/>
+          </w:tcPr>
+          <w:p>
+            <w:r/>
+            <w:r>
+              <w:rPr>
+                <w:rFonts w:ascii="Microsoft YaHei" w:hAnsi="Microsoft YaHei"/>
+                <w:b w:val="0"/>
+                <w:sz w:val="17"/>
+              </w:rPr>
+              <w:t>pass</w:t>
+            </w:r>
+          </w:p>
+        </w:tc>
+        <w:tc>
+          <w:tcPr>
+            <w:tcW w:type="dxa" w:w="3289"/>
+            <w:vAlign w:val="center"/>
+          </w:tcPr>
+          <w:p>
+            <w:r/>
+            <w:r>
+              <w:rPr>
+                <w:rFonts w:ascii="Microsoft YaHei" w:hAnsi="Microsoft YaHei"/>
+                <w:b w:val="0"/>
+                <w:sz w:val="17"/>
+              </w:rPr>
+              <w:t>`02_42题双轴重标与解析宝典.md` 有 42 个题卡标题</w:t>
+            </w:r>
+          </w:p>
+        </w:tc>
+      </w:tr>
+      <w:tr>
+        <w:tc>
+          <w:tcPr>
+            <w:tcW w:type="dxa" w:w="3289"/>
+            <w:vAlign w:val="center"/>
+          </w:tcPr>
+          <w:p>
+            <w:r/>
+            <w:r>
+              <w:rPr>
+                <w:rFonts w:ascii="Microsoft YaHei" w:hAnsi="Microsoft YaHei"/>
+                <w:b w:val="0"/>
+                <w:sz w:val="17"/>
+              </w:rPr>
+              <w:t>追溯矩阵</w:t>
+            </w:r>
+          </w:p>
+        </w:tc>
+        <w:tc>
+          <w:tcPr>
+            <w:tcW w:type="dxa" w:w="3289"/>
+            <w:vAlign w:val="center"/>
+          </w:tcPr>
+          <w:p>
+            <w:r/>
+            <w:r>
+              <w:rPr>
+                <w:rFonts w:ascii="Microsoft YaHei" w:hAnsi="Microsoft YaHei"/>
+                <w:b w:val="0"/>
+                <w:sz w:val="17"/>
+              </w:rPr>
+              <w:t>pass</w:t>
+            </w:r>
+          </w:p>
+        </w:tc>
+        <w:tc>
+          <w:tcPr>
+            <w:tcW w:type="dxa" w:w="3289"/>
+            <w:vAlign w:val="center"/>
+          </w:tcPr>
+          <w:p>
+            <w:r/>
+            <w:r>
+              <w:rPr>
+                <w:rFonts w:ascii="Microsoft YaHei" w:hAnsi="Microsoft YaHei"/>
+                <w:b w:val="0"/>
+                <w:sz w:val="17"/>
+              </w:rPr>
+              <w:t>`TRACEABILITY_MATRIX_v13_1_round05_patched.csv` 有 42 行、42 个唯一 question_id</w:t>
+            </w:r>
+          </w:p>
+        </w:tc>
+      </w:tr>
+      <w:tr>
+        <w:tc>
+          <w:tcPr>
+            <w:tcW w:type="dxa" w:w="3289"/>
+            <w:vAlign w:val="center"/>
+          </w:tcPr>
+          <w:p>
+            <w:r/>
+            <w:r>
+              <w:rPr>
+                <w:rFonts w:ascii="Microsoft YaHei" w:hAnsi="Microsoft YaHei"/>
+                <w:b w:val="0"/>
+                <w:sz w:val="17"/>
+              </w:rPr>
+              <w:t>题卡字段</w:t>
+            </w:r>
+          </w:p>
+        </w:tc>
+        <w:tc>
+          <w:tcPr>
+            <w:tcW w:type="dxa" w:w="3289"/>
+            <w:vAlign w:val="center"/>
+          </w:tcPr>
+          <w:p>
+            <w:r/>
+            <w:r>
+              <w:rPr>
+                <w:rFonts w:ascii="Microsoft YaHei" w:hAnsi="Microsoft YaHei"/>
+                <w:b w:val="0"/>
+                <w:sz w:val="17"/>
+              </w:rPr>
+              <w:t>pass</w:t>
+            </w:r>
+          </w:p>
+        </w:tc>
+        <w:tc>
+          <w:tcPr>
+            <w:tcW w:type="dxa" w:w="3289"/>
+            <w:vAlign w:val="center"/>
+          </w:tcPr>
+          <w:p>
+            <w:r/>
+            <w:r>
+              <w:rPr>
+                <w:rFonts w:ascii="Microsoft YaHei" w:hAnsi="Microsoft YaHei"/>
+                <w:b w:val="0"/>
+                <w:sz w:val="17"/>
+              </w:rPr>
+              <w:t>A轴主入口、B轴设问动作、命题路径、材料触发、答案骨架、学生预警、评分锚点、材料核心、证据状态均为 42 项</w:t>
+            </w:r>
+          </w:p>
+        </w:tc>
+      </w:tr>
+      <w:tr>
+        <w:tc>
+          <w:tcPr>
+            <w:tcW w:type="dxa" w:w="3289"/>
+            <w:vAlign w:val="center"/>
+          </w:tcPr>
+          <w:p>
+            <w:r/>
+            <w:r>
+              <w:rPr>
+                <w:rFonts w:ascii="Microsoft YaHei" w:hAnsi="Microsoft YaHei"/>
+                <w:b w:val="0"/>
+                <w:sz w:val="17"/>
+              </w:rPr>
+              <w:t>开放容器</w:t>
+            </w:r>
+          </w:p>
+        </w:tc>
+        <w:tc>
+          <w:tcPr>
+            <w:tcW w:type="dxa" w:w="3289"/>
+            <w:vAlign w:val="center"/>
+          </w:tcPr>
+          <w:p>
+            <w:r/>
+            <w:r>
+              <w:rPr>
+                <w:rFonts w:ascii="Microsoft YaHei" w:hAnsi="Microsoft YaHei"/>
+                <w:b w:val="0"/>
+                <w:sz w:val="17"/>
+              </w:rPr>
+              <w:t>pass</w:t>
+            </w:r>
+          </w:p>
+        </w:tc>
+        <w:tc>
+          <w:tcPr>
+            <w:tcW w:type="dxa" w:w="3289"/>
+            <w:vAlign w:val="center"/>
+          </w:tcPr>
+          <w:p>
+            <w:r/>
+            <w:r>
+              <w:rPr>
+                <w:rFonts w:ascii="Microsoft YaHei" w:hAnsi="Microsoft YaHei"/>
+                <w:b w:val="0"/>
+                <w:sz w:val="17"/>
+              </w:rPr>
+              <w:t>`04_开放容器与不晋升题附录.md` 单列，不进入 42 道 locked core 正文</w:t>
+            </w:r>
+          </w:p>
+        </w:tc>
+      </w:tr>
+      <w:tr>
+        <w:tc>
+          <w:tcPr>
+            <w:tcW w:type="dxa" w:w="3289"/>
+            <w:vAlign w:val="center"/>
+          </w:tcPr>
+          <w:p>
+            <w:r/>
+            <w:r>
+              <w:rPr>
+                <w:rFonts w:ascii="Microsoft YaHei" w:hAnsi="Microsoft YaHei"/>
+                <w:b w:val="0"/>
+                <w:sz w:val="17"/>
+              </w:rPr>
+              <w:t>旧框架继承</w:t>
+            </w:r>
+          </w:p>
+        </w:tc>
+        <w:tc>
+          <w:tcPr>
+            <w:tcW w:type="dxa" w:w="3289"/>
+            <w:vAlign w:val="center"/>
+          </w:tcPr>
+          <w:p>
+            <w:r/>
+            <w:r>
+              <w:rPr>
+                <w:rFonts w:ascii="Microsoft YaHei" w:hAnsi="Microsoft YaHei"/>
+                <w:b w:val="0"/>
+                <w:sz w:val="17"/>
+              </w:rPr>
+              <w:t>pass</w:t>
+            </w:r>
+          </w:p>
+        </w:tc>
+        <w:tc>
+          <w:tcPr>
+            <w:tcW w:type="dxa" w:w="3289"/>
+            <w:vAlign w:val="center"/>
+          </w:tcPr>
+          <w:p>
+            <w:r/>
+            <w:r>
+              <w:rPr>
+                <w:rFonts w:ascii="Microsoft YaHei" w:hAnsi="Microsoft YaHei"/>
+                <w:b w:val="0"/>
+                <w:sz w:val="17"/>
+              </w:rPr>
+              <w:t>Round06 投喂包包含旧框架逐页结构、有效维度、主要问题；GPT Round06 判断 v13.1 保住旧框架强项并修掉主要弱项</w:t>
+            </w:r>
+          </w:p>
+        </w:tc>
+      </w:tr>
+      <w:tr>
+        <w:tc>
+          <w:tcPr>
+            <w:tcW w:type="dxa" w:w="3289"/>
+            <w:vAlign w:val="center"/>
+          </w:tcPr>
+          <w:p>
+            <w:r/>
+            <w:r>
+              <w:rPr>
+                <w:rFonts w:ascii="Microsoft YaHei" w:hAnsi="Microsoft YaHei"/>
+                <w:b w:val="0"/>
+                <w:sz w:val="17"/>
+              </w:rPr>
+              <w:t>模型真实性</w:t>
+            </w:r>
+          </w:p>
+        </w:tc>
+        <w:tc>
+          <w:tcPr>
+            <w:tcW w:type="dxa" w:w="3289"/>
+            <w:vAlign w:val="center"/>
+          </w:tcPr>
+          <w:p>
+            <w:r/>
+            <w:r>
+              <w:rPr>
+                <w:rFonts w:ascii="Microsoft YaHei" w:hAnsi="Microsoft YaHei"/>
+                <w:b w:val="0"/>
+                <w:sz w:val="17"/>
+              </w:rPr>
+              <w:t>pass</w:t>
+            </w:r>
+          </w:p>
+        </w:tc>
+        <w:tc>
+          <w:tcPr>
+            <w:tcW w:type="dxa" w:w="3289"/>
+            <w:vAlign w:val="center"/>
+          </w:tcPr>
+          <w:p>
+            <w:r/>
+            <w:r>
+              <w:rPr>
+                <w:rFonts w:ascii="Microsoft YaHei" w:hAnsi="Microsoft YaHei"/>
+                <w:b w:val="0"/>
+                <w:sz w:val="17"/>
+              </w:rPr>
+              <w:t>Round05 有真实 GPT Pro 与 Claude Opus 4.7 Adaptive web 输出；Round06 有真实 GPT Pro web 复评输出</w:t>
+            </w:r>
+          </w:p>
+        </w:tc>
+      </w:tr>
+      <w:tr>
+        <w:tc>
+          <w:tcPr>
+            <w:tcW w:type="dxa" w:w="3289"/>
+            <w:vAlign w:val="center"/>
+          </w:tcPr>
+          <w:p>
+            <w:r/>
+            <w:r>
+              <w:rPr>
+                <w:rFonts w:ascii="Microsoft YaHei" w:hAnsi="Microsoft YaHei"/>
+                <w:b w:val="0"/>
+                <w:sz w:val="17"/>
+              </w:rPr>
+              <w:t>补丁闭环</w:t>
+            </w:r>
+          </w:p>
+        </w:tc>
+        <w:tc>
+          <w:tcPr>
+            <w:tcW w:type="dxa" w:w="3289"/>
+            <w:vAlign w:val="center"/>
+          </w:tcPr>
+          <w:p>
+            <w:r/>
+            <w:r>
+              <w:rPr>
+                <w:rFonts w:ascii="Microsoft YaHei" w:hAnsi="Microsoft YaHei"/>
+                <w:b w:val="0"/>
+                <w:sz w:val="17"/>
+              </w:rPr>
+              <w:t>pass</w:t>
+            </w:r>
+          </w:p>
+        </w:tc>
+        <w:tc>
+          <w:tcPr>
+            <w:tcW w:type="dxa" w:w="3289"/>
+            <w:vAlign w:val="center"/>
+          </w:tcPr>
+          <w:p>
+            <w:r/>
+            <w:r>
+              <w:rPr>
+                <w:rFonts w:ascii="Microsoft YaHei" w:hAnsi="Microsoft YaHei"/>
+                <w:b w:val="0"/>
+                <w:sz w:val="17"/>
+              </w:rPr>
+              <w:t>CC0213 命题路径为 A8 劳动关系；CC0238 命题路径为 A5 知识产权与竞争秩序</w:t>
+            </w:r>
+          </w:p>
+        </w:tc>
+      </w:tr>
+      <w:tr>
+        <w:tc>
+          <w:tcPr>
+            <w:tcW w:type="dxa" w:w="3289"/>
+            <w:vAlign w:val="center"/>
+          </w:tcPr>
+          <w:p>
+            <w:r/>
+            <w:r>
+              <w:rPr>
+                <w:rFonts w:ascii="Microsoft YaHei" w:hAnsi="Microsoft YaHei"/>
+                <w:b w:val="0"/>
+                <w:sz w:val="17"/>
+              </w:rPr>
+              <w:t>PDF可读成品</w:t>
+            </w:r>
+          </w:p>
+        </w:tc>
+        <w:tc>
+          <w:tcPr>
+            <w:tcW w:type="dxa" w:w="3289"/>
+            <w:vAlign w:val="center"/>
+          </w:tcPr>
+          <w:p>
+            <w:r/>
+            <w:r>
+              <w:rPr>
+                <w:rFonts w:ascii="Microsoft YaHei" w:hAnsi="Microsoft YaHei"/>
+                <w:b w:val="0"/>
+                <w:sz w:val="17"/>
+              </w:rPr>
+              <w:t>pass</w:t>
+            </w:r>
+          </w:p>
+        </w:tc>
+        <w:tc>
+          <w:tcPr>
+            <w:tcW w:type="dxa" w:w="3289"/>
+            <w:vAlign w:val="center"/>
+          </w:tcPr>
+          <w:p>
+            <w:r/>
+            <w:r>
+              <w:rPr>
+                <w:rFonts w:ascii="Microsoft YaHei" w:hAnsi="Microsoft YaHei"/>
+                <w:b w:val="0"/>
+                <w:sz w:val="17"/>
+              </w:rPr>
+              <w:t>PDF 26 页，26 张页面渲染图，无 blank-like 页面；文本含 Round05、Round06、`ACCEPT_AFTER_MINOR_PATCHES`、`ACCEPT_WITH_MINOR_PATCHES`、`CC0251`、`Confucius`</w:t>
+            </w:r>
+          </w:p>
+        </w:tc>
+      </w:tr>
+      <w:tr>
+        <w:tc>
+          <w:tcPr>
+            <w:tcW w:type="dxa" w:w="3289"/>
+            <w:vAlign w:val="center"/>
+          </w:tcPr>
+          <w:p>
+            <w:r/>
+            <w:r>
+              <w:rPr>
+                <w:rFonts w:ascii="Microsoft YaHei" w:hAnsi="Microsoft YaHei"/>
+                <w:b w:val="0"/>
+                <w:sz w:val="17"/>
+              </w:rPr>
+              <w:t>DOCX成品</w:t>
+            </w:r>
+          </w:p>
+        </w:tc>
+        <w:tc>
+          <w:tcPr>
+            <w:tcW w:type="dxa" w:w="3289"/>
+            <w:vAlign w:val="center"/>
+          </w:tcPr>
+          <w:p>
+            <w:r/>
+            <w:r>
+              <w:rPr>
+                <w:rFonts w:ascii="Microsoft YaHei" w:hAnsi="Microsoft YaHei"/>
+                <w:b w:val="0"/>
+                <w:sz w:val="17"/>
+              </w:rPr>
+              <w:t>pass with caveat</w:t>
+            </w:r>
+          </w:p>
+        </w:tc>
+        <w:tc>
+          <w:tcPr>
+            <w:tcW w:type="dxa" w:w="3289"/>
+            <w:vAlign w:val="center"/>
+          </w:tcPr>
+          <w:p>
+            <w:r/>
+            <w:r>
+              <w:rPr>
+                <w:rFonts w:ascii="Microsoft YaHei" w:hAnsi="Microsoft YaHei"/>
+                <w:b w:val="0"/>
+                <w:sz w:val="17"/>
+              </w:rPr>
+              <w:t>DOCX 存在并通过 Word COM 打开，45 页、1191 段；本机缺 LibreOffice/soffice，不能声称 DOCX direct render QA passed</w:t>
+            </w:r>
+          </w:p>
+        </w:tc>
+      </w:tr>
+    </w:tbl>
+    <w:p/>
+    <w:p>
+      <w:pPr>
+        <w:pStyle w:val="Heading2"/>
+      </w:pPr>
+      <w:r>
+        <w:t>Confucius Verdict</w:t>
+      </w:r>
+    </w:p>
+    <w:p>
+      <w:pPr>
+        <w:spacing w:after="100"/>
+      </w:pPr>
+      <w:r>
+        <w:t>从学生学习路径看，本版可以作为当前选必二《法律与生活》法律宝典成品：它不是法律知识点目录，而是把每道题固定落到法律入口、设问动作、命题路径、材料触发、评分锚点、答案骨架和误区预警。零基础学生能沿题卡完成“看见什么 -&gt; 想到什么 -&gt; 按什么动作写 -&gt; 哪些话不能乱写”的迁移。</w:t>
+      </w:r>
+    </w:p>
+    <w:p>
+      <w:pPr>
+        <w:spacing w:after="100"/>
+      </w:pPr>
+      <w:r>
+        <w:t>保留 caveat：DOCX 只能说“已生成并可由 Word 打开”，不能说“DOCX 直渲染视觉 QA 已通过”。PDF 已完成渲染页检查。</w:t>
       </w:r>
     </w:p>
     <w:sectPr>

</xml_diff>